<commit_message>
doc or feat: all answer scored by two people (I and my brother Omer Faruk) and mixed their answers
</commit_message>
<xml_diff>
--- a/test/StackEval_ToDo_List.docx
+++ b/test/StackEval_ToDo_List.docx
@@ -52,7 +52,7 @@
         <w:pStyle w:val="Heading4"/>
       </w:pPr>
       <w:r>
-        <w:t>Python function returns None</w:t>
+        <w:t>Python remove duplicates from list</w:t>
       </w:r>
     </w:p>
     <w:p>
@@ -65,7 +65,7 @@
       </w:r>
       <w:r>
         <w:br/>
-        <w:t>I am trying to update a value inside a function, but it always returns None.</w:t>
+        <w:t>I have a list with duplicate values, and I want to remove the duplicates.</w:t>
       </w:r>
       <w:r>
         <w:br/>
@@ -76,109 +76,35 @@
       </w:r>
       <w:r>
         <w:br/>
-        <w:t xml:space="preserve">def </w:t>
       </w:r>
       <w:proofErr w:type="spellStart"/>
       <w:r>
-        <w:t>change_value</w:t>
+        <w:t>my_list</w:t>
       </w:r>
       <w:proofErr w:type="spellEnd"/>
       <w:r>
-        <w:t>(x):</w:t>
-      </w:r>
-      <w:r>
-        <w:br/>
-        <w:t>x = x + 5</w:t>
-      </w:r>
-      <w:r>
-        <w:br/>
-      </w:r>
-      <w:r>
-        <w:br/>
-        <w:t xml:space="preserve">result = </w:t>
+        <w:t xml:space="preserve"> = [1, 2, 2, 3, 4, 4, 5]</w:t>
+      </w:r>
+      <w:r>
+        <w:br/>
+      </w:r>
+      <w:r>
+        <w:br/>
+        <w:t># remove duplicates here</w:t>
+      </w:r>
+      <w:r>
+        <w:br/>
+      </w:r>
+      <w:r>
+        <w:br/>
+        <w:t>print(</w:t>
       </w:r>
       <w:proofErr w:type="spellStart"/>
       <w:r>
-        <w:t>change_value</w:t>
+        <w:t>my_list</w:t>
       </w:r>
       <w:proofErr w:type="spellEnd"/>
       <w:r>
-        <w:t>(10)</w:t>
-      </w:r>
-      <w:r>
-        <w:br/>
-        <w:t>print(result)</w:t>
-      </w:r>
-      <w:r>
-        <w:br/>
-      </w:r>
-      <w:r>
-        <w:br/>
-        <w:t>Why does this function return None, and how can I fix it so that it returns the updated value?</w:t>
-      </w:r>
-      <w:r>
-        <w:br/>
-        <w:t>"""</w:t>
-      </w:r>
-    </w:p>
-    <w:p>
-      <w:pPr>
-        <w:pStyle w:val="Heading4"/>
-      </w:pPr>
-      <w:r>
-        <w:t>Python remove duplicates from list</w:t>
-      </w:r>
-    </w:p>
-    <w:p>
-      <w:r>
-        <w:t>"""</w:t>
-      </w:r>
-      <w:r>
-        <w:br/>
-        <w:t>Question:</w:t>
-      </w:r>
-      <w:r>
-        <w:br/>
-        <w:t>I have a list with duplicate values, and I want to remove the duplicates.</w:t>
-      </w:r>
-      <w:r>
-        <w:br/>
-      </w:r>
-      <w:r>
-        <w:br/>
-        <w:t>Code:</w:t>
-      </w:r>
-      <w:r>
-        <w:br/>
-      </w:r>
-      <w:proofErr w:type="spellStart"/>
-      <w:r>
-        <w:t>my_list</w:t>
-      </w:r>
-      <w:proofErr w:type="spellEnd"/>
-      <w:r>
-        <w:t xml:space="preserve"> = [1, 2, 2, 3, 4, 4, 5]</w:t>
-      </w:r>
-      <w:r>
-        <w:br/>
-      </w:r>
-      <w:r>
-        <w:br/>
-        <w:t># remove duplicates here</w:t>
-      </w:r>
-      <w:r>
-        <w:br/>
-      </w:r>
-      <w:r>
-        <w:br/>
-        <w:t>print(</w:t>
-      </w:r>
-      <w:proofErr w:type="spellStart"/>
-      <w:r>
-        <w:t>my_list</w:t>
-      </w:r>
-      <w:proofErr w:type="spellEnd"/>
-      <w:r>
         <w:t>)</w:t>
       </w:r>
       <w:r>
@@ -187,127 +113,6 @@
       <w:r>
         <w:br/>
         <w:t>What is the best way to remove duplicate values from this list?</w:t>
-      </w:r>
-      <w:r>
-        <w:br/>
-        <w:t>"""</w:t>
-      </w:r>
-    </w:p>
-    <w:p>
-      <w:pPr>
-        <w:pStyle w:val="Heading4"/>
-      </w:pPr>
-      <w:r>
-        <w:t>Python list not updating in function</w:t>
-      </w:r>
-    </w:p>
-    <w:p>
-      <w:r>
-        <w:t>"""</w:t>
-      </w:r>
-      <w:r>
-        <w:br/>
-        <w:t>Question:</w:t>
-      </w:r>
-      <w:r>
-        <w:br/>
-      </w:r>
-      <w:r>
-        <w:lastRenderedPageBreak/>
-        <w:t>I am trying to update a list inside a function, but the changes are not reflected outside the function.</w:t>
-      </w:r>
-      <w:r>
-        <w:br/>
-      </w:r>
-      <w:r>
-        <w:br/>
-        <w:t>Code:</w:t>
-      </w:r>
-      <w:r>
-        <w:br/>
-        <w:t xml:space="preserve">def </w:t>
-      </w:r>
-      <w:proofErr w:type="spellStart"/>
-      <w:r>
-        <w:t>update_list</w:t>
-      </w:r>
-      <w:proofErr w:type="spellEnd"/>
-      <w:r>
-        <w:t>(</w:t>
-      </w:r>
-      <w:proofErr w:type="spellStart"/>
-      <w:r>
-        <w:t>lst</w:t>
-      </w:r>
-      <w:proofErr w:type="spellEnd"/>
-      <w:r>
-        <w:t>):</w:t>
-      </w:r>
-      <w:r>
-        <w:br/>
-      </w:r>
-      <w:proofErr w:type="spellStart"/>
-      <w:r>
-        <w:t>lst</w:t>
-      </w:r>
-      <w:proofErr w:type="spellEnd"/>
-      <w:r>
-        <w:t xml:space="preserve"> = [1, 2, 3]</w:t>
-      </w:r>
-      <w:r>
-        <w:br/>
-      </w:r>
-      <w:r>
-        <w:br/>
-      </w:r>
-      <w:proofErr w:type="spellStart"/>
-      <w:r>
-        <w:t>my_list</w:t>
-      </w:r>
-      <w:proofErr w:type="spellEnd"/>
-      <w:r>
-        <w:t xml:space="preserve"> = [5, 6, 7]</w:t>
-      </w:r>
-      <w:r>
-        <w:br/>
-      </w:r>
-      <w:proofErr w:type="spellStart"/>
-      <w:r>
-        <w:t>update_list</w:t>
-      </w:r>
-      <w:proofErr w:type="spellEnd"/>
-      <w:r>
-        <w:t>(</w:t>
-      </w:r>
-      <w:proofErr w:type="spellStart"/>
-      <w:r>
-        <w:t>my_list</w:t>
-      </w:r>
-      <w:proofErr w:type="spellEnd"/>
-      <w:r>
-        <w:t>)</w:t>
-      </w:r>
-      <w:r>
-        <w:br/>
-      </w:r>
-      <w:r>
-        <w:br/>
-        <w:t>print(</w:t>
-      </w:r>
-      <w:proofErr w:type="spellStart"/>
-      <w:r>
-        <w:t>my_list</w:t>
-      </w:r>
-      <w:proofErr w:type="spellEnd"/>
-      <w:r>
-        <w:t>)</w:t>
-      </w:r>
-      <w:r>
-        <w:br/>
-      </w:r>
-      <w:r>
-        <w:br/>
-        <w:t>Why is the original list not updated, and how can I fix this?</w:t>
       </w:r>
       <w:r>
         <w:br/>
@@ -381,6 +186,7 @@
         <w:pStyle w:val="Heading3"/>
       </w:pPr>
       <w:r>
+        <w:lastRenderedPageBreak/>
         <w:t>Medium</w:t>
       </w:r>
     </w:p>
@@ -434,7 +240,6 @@
         <w:br/>
       </w:r>
       <w:r>
-        <w:lastRenderedPageBreak/>
         <w:br/>
         <w:t xml:space="preserve">Why do I get a </w:t>
       </w:r>
@@ -588,7 +393,11 @@
       </w:r>
       <w:r>
         <w:br/>
-        <w:t>I am trying to modify a string inside a function, but the change is not reflected outside the function.</w:t>
+        <w:t xml:space="preserve">I am trying to modify a string inside a function, but the change is not reflected outside the </w:t>
+      </w:r>
+      <w:r>
+        <w:lastRenderedPageBreak/>
+        <w:t>function.</w:t>
       </w:r>
       <w:r>
         <w:br/>
@@ -651,10 +460,72 @@
       </w:r>
       <w:r>
         <w:br/>
-      </w:r>
-      <w:r>
-        <w:lastRenderedPageBreak/>
         <w:t>Why is the original string not changed, and how can I fix this?</w:t>
+      </w:r>
+      <w:r>
+        <w:br/>
+        <w:t>"""</w:t>
+      </w:r>
+    </w:p>
+    <w:p>
+      <w:pPr>
+        <w:pStyle w:val="Heading4"/>
+      </w:pPr>
+      <w:r>
+        <w:t>Python – Dictionary modify during iteration</w:t>
+      </w:r>
+    </w:p>
+    <w:p>
+      <w:r>
+        <w:t>"""</w:t>
+      </w:r>
+      <w:r>
+        <w:br/>
+        <w:t>Question:</w:t>
+      </w:r>
+      <w:r>
+        <w:br/>
+        <w:t>I am trying to remove items from a dictionary while looping over it, but I get an error.</w:t>
+      </w:r>
+      <w:r>
+        <w:br/>
+      </w:r>
+      <w:r>
+        <w:br/>
+        <w:t>Code:</w:t>
+      </w:r>
+      <w:r>
+        <w:br/>
+        <w:t>data = {"a": 1, "b": 2, "c": 3}</w:t>
+      </w:r>
+      <w:r>
+        <w:br/>
+      </w:r>
+      <w:r>
+        <w:br/>
+        <w:t>for key in data:</w:t>
+      </w:r>
+      <w:r>
+        <w:br/>
+        <w:t>if data[key] &gt; 1:</w:t>
+      </w:r>
+      <w:r>
+        <w:br/>
+        <w:t>del data[key]</w:t>
+      </w:r>
+      <w:r>
+        <w:br/>
+      </w:r>
+      <w:r>
+        <w:br/>
+        <w:t>print(data)</w:t>
+      </w:r>
+      <w:r>
+        <w:br/>
+      </w:r>
+      <w:r>
+        <w:br/>
+        <w:t>Why does this cause an error, and how can I fix it?</w:t>
       </w:r>
       <w:r>
         <w:br/>
@@ -668,6 +539,80 @@
       </w:pPr>
       <w:r>
         <w:t>Hard</w:t>
+      </w:r>
+    </w:p>
+    <w:p>
+      <w:pPr>
+        <w:pStyle w:val="Heading4"/>
+      </w:pPr>
+      <w:r>
+        <w:t>Python Shallow vs Deep Copy</w:t>
+      </w:r>
+    </w:p>
+    <w:p>
+      <w:r>
+        <w:t>"""</w:t>
+      </w:r>
+      <w:r>
+        <w:br/>
+        <w:t>Question:</w:t>
+      </w:r>
+      <w:r>
+        <w:br/>
+        <w:t>I copied a list, but when I modify the copy, the original list also changes.</w:t>
+      </w:r>
+      <w:r>
+        <w:br/>
+      </w:r>
+      <w:r>
+        <w:br/>
+        <w:t>Code:</w:t>
+      </w:r>
+      <w:r>
+        <w:br/>
+        <w:t>original = [[1, 2], [3, 4]]</w:t>
+      </w:r>
+      <w:r>
+        <w:br/>
+        <w:t xml:space="preserve">copied = </w:t>
+      </w:r>
+      <w:proofErr w:type="spellStart"/>
+      <w:r>
+        <w:t>original.copy</w:t>
+      </w:r>
+      <w:proofErr w:type="spellEnd"/>
+      <w:r>
+        <w:t>()</w:t>
+      </w:r>
+      <w:r>
+        <w:br/>
+      </w:r>
+      <w:r>
+        <w:br/>
+        <w:t>copied[0][0] = 99</w:t>
+      </w:r>
+      <w:r>
+        <w:br/>
+      </w:r>
+      <w:r>
+        <w:lastRenderedPageBreak/>
+        <w:br/>
+        <w:t>print(original)</w:t>
+      </w:r>
+      <w:r>
+        <w:br/>
+        <w:t>print(copied)</w:t>
+      </w:r>
+      <w:r>
+        <w:br/>
+      </w:r>
+      <w:r>
+        <w:br/>
+        <w:t>Why does changing the copied list also affect the original, and how can I fix this?</w:t>
+      </w:r>
+      <w:r>
+        <w:br/>
+        <w:t>"""</w:t>
       </w:r>
     </w:p>
     <w:p>
@@ -2578,193 +2523,93 @@
         <w:pStyle w:val="Heading4"/>
       </w:pPr>
       <w:r>
-        <w:t xml:space="preserve"> Java add object to </w:t>
-      </w:r>
-      <w:proofErr w:type="spellStart"/>
-      <w:r>
-        <w:t>ArrayList</w:t>
-      </w:r>
-      <w:proofErr w:type="spellEnd"/>
+        <w:t>Java string not changing in method</w:t>
+      </w:r>
     </w:p>
     <w:p>
+      <w:r>
+        <w:t>"""</w:t>
+      </w:r>
+      <w:r>
+        <w:br/>
+        <w:t>Question:</w:t>
+      </w:r>
+      <w:r>
+        <w:br/>
+        <w:t>I am trying to modify a string, but the value does not change as expected.</w:t>
+      </w:r>
+      <w:r>
+        <w:br/>
+      </w:r>
+      <w:r>
+        <w:br/>
+        <w:t>Code:</w:t>
+      </w:r>
+      <w:r>
+        <w:br/>
+        <w:t>public class Main {</w:t>
+      </w:r>
+      <w:r>
+        <w:br/>
+        <w:t xml:space="preserve">public static void main(String[] </w:t>
+      </w:r>
       <w:proofErr w:type="spellStart"/>
       <w:r>
-        <w:t>raw_question</w:t>
+        <w:t>args</w:t>
       </w:r>
       <w:proofErr w:type="spellEnd"/>
       <w:r>
-        <w:t xml:space="preserve"> = """</w:t>
-      </w:r>
-    </w:p>
-    <w:p>
-      <w:r>
-        <w:t>Question:</w:t>
-      </w:r>
-    </w:p>
-    <w:p>
-      <w:r>
-        <w:t xml:space="preserve">I am trying to add an object to an </w:t>
+        <w:t>) {</w:t>
+      </w:r>
+      <w:r>
+        <w:br/>
+        <w:t>String text = "hello";</w:t>
+      </w:r>
+      <w:r>
+        <w:br/>
+      </w:r>
+      <w:r>
+        <w:br/>
       </w:r>
       <w:proofErr w:type="spellStart"/>
       <w:r>
-        <w:t>ArrayList</w:t>
+        <w:t>text.replace</w:t>
       </w:r>
       <w:proofErr w:type="spellEnd"/>
       <w:r>
-        <w:t>, but it does not seem to work as expected.</w:t>
-      </w:r>
-    </w:p>
-    <w:p/>
-    <w:p>
-      <w:r>
-        <w:t>Code:</w:t>
-      </w:r>
-    </w:p>
-    <w:p>
-      <w:r>
-        <w:t xml:space="preserve">import </w:t>
+        <w:t>("h", "H");</w:t>
+      </w:r>
+      <w:r>
+        <w:br/>
+      </w:r>
+      <w:r>
+        <w:br/>
       </w:r>
       <w:proofErr w:type="spellStart"/>
       <w:r>
-        <w:t>java.util.ArrayList</w:t>
+        <w:t>System.out.println</w:t>
       </w:r>
       <w:proofErr w:type="spellEnd"/>
       <w:r>
-        <w:t>;</w:t>
-      </w:r>
-    </w:p>
-    <w:p/>
-    <w:p>
-      <w:r>
-        <w:t>class Person {</w:t>
-      </w:r>
-    </w:p>
-    <w:p>
-      <w:r>
-        <w:t xml:space="preserve">    String name;</w:t>
-      </w:r>
-    </w:p>
-    <w:p/>
-    <w:p>
-      <w:r>
-        <w:t xml:space="preserve">    Person(String name) {</w:t>
-      </w:r>
-    </w:p>
-    <w:p>
-      <w:r>
-        <w:t xml:space="preserve">        this.name = name;</w:t>
-      </w:r>
-    </w:p>
-    <w:p>
-      <w:r>
-        <w:t xml:space="preserve">    }</w:t>
-      </w:r>
-    </w:p>
-    <w:p>
-      <w:r>
+        <w:t>(text);</w:t>
+      </w:r>
+      <w:r>
+        <w:br/>
         <w:t>}</w:t>
       </w:r>
-    </w:p>
-    <w:p/>
-    <w:p>
-      <w:r>
-        <w:t>public class Main {</w:t>
-      </w:r>
-    </w:p>
-    <w:p>
-      <w:r>
-        <w:t xml:space="preserve">    public static void main(String[] </w:t>
-      </w:r>
-      <w:proofErr w:type="spellStart"/>
-      <w:r>
-        <w:t>args</w:t>
-      </w:r>
-      <w:proofErr w:type="spellEnd"/>
-      <w:r>
-        <w:t>) {</w:t>
-      </w:r>
-    </w:p>
-    <w:p>
-      <w:r>
-        <w:t xml:space="preserve">        </w:t>
-      </w:r>
-      <w:proofErr w:type="spellStart"/>
-      <w:r>
-        <w:t>ArrayList</w:t>
-      </w:r>
-      <w:proofErr w:type="spellEnd"/>
-      <w:r>
-        <w:t xml:space="preserve">&lt;Person&gt; people = new </w:t>
-      </w:r>
-      <w:proofErr w:type="spellStart"/>
-      <w:r>
-        <w:t>ArrayList</w:t>
-      </w:r>
-      <w:proofErr w:type="spellEnd"/>
-      <w:r>
-        <w:t>&lt;&gt;();</w:t>
-      </w:r>
-    </w:p>
-    <w:p/>
-    <w:p>
-      <w:r>
-        <w:t xml:space="preserve">        Person p = new Person("Alice");</w:t>
-      </w:r>
-    </w:p>
-    <w:p/>
-    <w:p>
-      <w:r>
-        <w:t xml:space="preserve">        </w:t>
-      </w:r>
-      <w:proofErr w:type="spellStart"/>
-      <w:r>
-        <w:t>people.add</w:t>
-      </w:r>
-      <w:proofErr w:type="spellEnd"/>
-      <w:r>
-        <w:t>(p);</w:t>
-      </w:r>
-    </w:p>
-    <w:p/>
-    <w:p>
-      <w:r>
-        <w:t xml:space="preserve">        </w:t>
-      </w:r>
-      <w:proofErr w:type="spellStart"/>
-      <w:r>
-        <w:t>System.out.println</w:t>
-      </w:r>
-      <w:proofErr w:type="spellEnd"/>
-      <w:r>
-        <w:t>(people);</w:t>
-      </w:r>
-    </w:p>
-    <w:p>
-      <w:r>
-        <w:t xml:space="preserve">    }</w:t>
-      </w:r>
-    </w:p>
-    <w:p>
-      <w:r>
+      <w:r>
+        <w:br/>
         <w:t>}</w:t>
       </w:r>
-    </w:p>
-    <w:p/>
-    <w:p>
-      <w:r>
-        <w:t xml:space="preserve">How can I correctly add objects to an </w:t>
-      </w:r>
-      <w:proofErr w:type="spellStart"/>
-      <w:r>
-        <w:t>ArrayList</w:t>
-      </w:r>
-      <w:proofErr w:type="spellEnd"/>
-      <w:r>
-        <w:t xml:space="preserve"> and access their values?</w:t>
-      </w:r>
-    </w:p>
-    <w:p>
-      <w:r>
+      <w:r>
+        <w:br/>
+      </w:r>
+      <w:r>
+        <w:br/>
+        <w:t>Why is the string not updated, and how can I fix this?</w:t>
+      </w:r>
+      <w:r>
+        <w:br/>
         <w:t>"""</w:t>
       </w:r>
     </w:p>
@@ -2773,101 +2618,6 @@
         <w:pStyle w:val="Heading4"/>
       </w:pPr>
       <w:r>
-        <w:t xml:space="preserve"> Java string not changing in method</w:t>
-      </w:r>
-    </w:p>
-    <w:p>
-      <w:r>
-        <w:t>"""</w:t>
-      </w:r>
-      <w:r>
-        <w:br/>
-        <w:t>Question:</w:t>
-      </w:r>
-      <w:r>
-        <w:br/>
-        <w:t>I am trying to modify a string, but the value does not change as expected.</w:t>
-      </w:r>
-      <w:r>
-        <w:br/>
-      </w:r>
-      <w:r>
-        <w:br/>
-        <w:t>Code:</w:t>
-      </w:r>
-      <w:r>
-        <w:br/>
-        <w:t>public class Main {</w:t>
-      </w:r>
-      <w:r>
-        <w:br/>
-        <w:t xml:space="preserve">public static void main(String[] </w:t>
-      </w:r>
-      <w:proofErr w:type="spellStart"/>
-      <w:r>
-        <w:t>args</w:t>
-      </w:r>
-      <w:proofErr w:type="spellEnd"/>
-      <w:r>
-        <w:t>) {</w:t>
-      </w:r>
-      <w:r>
-        <w:br/>
-        <w:t>String text = "hello";</w:t>
-      </w:r>
-      <w:r>
-        <w:br/>
-      </w:r>
-      <w:r>
-        <w:br/>
-      </w:r>
-      <w:proofErr w:type="spellStart"/>
-      <w:r>
-        <w:t>text.replace</w:t>
-      </w:r>
-      <w:proofErr w:type="spellEnd"/>
-      <w:r>
-        <w:t>("h", "H");</w:t>
-      </w:r>
-      <w:r>
-        <w:br/>
-      </w:r>
-      <w:r>
-        <w:br/>
-      </w:r>
-      <w:proofErr w:type="spellStart"/>
-      <w:r>
-        <w:t>System.out.println</w:t>
-      </w:r>
-      <w:proofErr w:type="spellEnd"/>
-      <w:r>
-        <w:t>(text);</w:t>
-      </w:r>
-      <w:r>
-        <w:br/>
-        <w:t>}</w:t>
-      </w:r>
-      <w:r>
-        <w:br/>
-        <w:t>}</w:t>
-      </w:r>
-      <w:r>
-        <w:br/>
-      </w:r>
-      <w:r>
-        <w:br/>
-        <w:t>Why is the string not updated, and how can I fix this?</w:t>
-      </w:r>
-      <w:r>
-        <w:br/>
-        <w:t>"""</w:t>
-      </w:r>
-    </w:p>
-    <w:p>
-      <w:pPr>
-        <w:pStyle w:val="Heading4"/>
-      </w:pPr>
-      <w:r>
         <w:t xml:space="preserve"> Java loop through </w:t>
       </w:r>
       <w:proofErr w:type="spellStart"/>
@@ -2905,84 +2655,82 @@
       </w:r>
       <w:r>
         <w:br/>
-      </w:r>
+        <w:t xml:space="preserve">import </w:t>
+      </w:r>
+      <w:proofErr w:type="spellStart"/>
+      <w:r>
+        <w:t>java.util.ArrayList</w:t>
+      </w:r>
+      <w:proofErr w:type="spellEnd"/>
+      <w:r>
+        <w:t>;</w:t>
+      </w:r>
+      <w:r>
+        <w:br/>
+      </w:r>
+      <w:r>
+        <w:br/>
+        <w:t>public class Main {</w:t>
+      </w:r>
+      <w:r>
+        <w:br/>
+        <w:t xml:space="preserve">public static void main(String[] </w:t>
+      </w:r>
+      <w:proofErr w:type="spellStart"/>
+      <w:r>
+        <w:t>args</w:t>
+      </w:r>
+      <w:proofErr w:type="spellEnd"/>
+      <w:r>
+        <w:t>) {</w:t>
+      </w:r>
+      <w:r>
+        <w:br/>
+      </w:r>
+      <w:proofErr w:type="spellStart"/>
+      <w:r>
+        <w:t>ArrayList</w:t>
+      </w:r>
+      <w:proofErr w:type="spellEnd"/>
+      <w:r>
+        <w:t xml:space="preserve">&lt;String&gt; items = new </w:t>
+      </w:r>
+      <w:proofErr w:type="spellStart"/>
+      <w:r>
+        <w:t>ArrayList</w:t>
+      </w:r>
+      <w:proofErr w:type="spellEnd"/>
+      <w:r>
+        <w:t>&lt;&gt;();</w:t>
+      </w:r>
+      <w:r>
+        <w:br/>
+      </w:r>
+      <w:proofErr w:type="spellStart"/>
+      <w:r>
+        <w:t>items.add</w:t>
+      </w:r>
+      <w:proofErr w:type="spellEnd"/>
+      <w:r>
+        <w:t>("A");</w:t>
+      </w:r>
+      <w:r>
+        <w:br/>
+      </w:r>
+      <w:proofErr w:type="spellStart"/>
+      <w:r>
+        <w:t>items.add</w:t>
+      </w:r>
+      <w:proofErr w:type="spellEnd"/>
+      <w:r>
+        <w:t>("B");</w:t>
+      </w:r>
+      <w:r>
+        <w:br/>
+      </w:r>
+      <w:proofErr w:type="spellStart"/>
       <w:r>
         <w:lastRenderedPageBreak/>
-        <w:t xml:space="preserve">import </w:t>
-      </w:r>
-      <w:proofErr w:type="spellStart"/>
-      <w:r>
-        <w:t>java.util.ArrayList</w:t>
-      </w:r>
-      <w:proofErr w:type="spellEnd"/>
-      <w:r>
-        <w:t>;</w:t>
-      </w:r>
-      <w:r>
-        <w:br/>
-      </w:r>
-      <w:r>
-        <w:br/>
-        <w:t>public class Main {</w:t>
-      </w:r>
-      <w:r>
-        <w:br/>
-        <w:t xml:space="preserve">public static void main(String[] </w:t>
-      </w:r>
-      <w:proofErr w:type="spellStart"/>
-      <w:r>
-        <w:t>args</w:t>
-      </w:r>
-      <w:proofErr w:type="spellEnd"/>
-      <w:r>
-        <w:t>) {</w:t>
-      </w:r>
-      <w:r>
-        <w:br/>
-      </w:r>
-      <w:proofErr w:type="spellStart"/>
-      <w:r>
-        <w:t>ArrayList</w:t>
-      </w:r>
-      <w:proofErr w:type="spellEnd"/>
-      <w:r>
-        <w:t xml:space="preserve">&lt;String&gt; items = new </w:t>
-      </w:r>
-      <w:proofErr w:type="spellStart"/>
-      <w:r>
-        <w:t>ArrayList</w:t>
-      </w:r>
-      <w:proofErr w:type="spellEnd"/>
-      <w:r>
-        <w:t>&lt;&gt;();</w:t>
-      </w:r>
-      <w:r>
-        <w:br/>
-      </w:r>
-      <w:proofErr w:type="spellStart"/>
-      <w:r>
-        <w:t>items.add</w:t>
-      </w:r>
-      <w:proofErr w:type="spellEnd"/>
-      <w:r>
-        <w:t>("A");</w:t>
-      </w:r>
-      <w:r>
-        <w:br/>
-      </w:r>
-      <w:proofErr w:type="spellStart"/>
-      <w:r>
-        <w:t>items.add</w:t>
-      </w:r>
-      <w:proofErr w:type="spellEnd"/>
-      <w:r>
-        <w:t>("B");</w:t>
-      </w:r>
-      <w:r>
-        <w:br/>
-      </w:r>
-      <w:proofErr w:type="spellStart"/>
-      <w:r>
         <w:t>items.add</w:t>
       </w:r>
       <w:proofErr w:type="spellEnd"/>
@@ -3040,12 +2788,13 @@
         <w:t>Medium</w:t>
       </w:r>
     </w:p>
+    <w:p/>
     <w:p>
       <w:pPr>
         <w:pStyle w:val="Heading4"/>
       </w:pPr>
       <w:r>
-        <w:t xml:space="preserve"> Java object null pointer exception</w:t>
+        <w:t>Java remove while iterating</w:t>
       </w:r>
     </w:p>
     <w:p>
@@ -3058,30 +2807,130 @@
       </w:r>
       <w:r>
         <w:br/>
-        <w:t xml:space="preserve">I am getting a </w:t>
+        <w:t>I am trying to remove elements from a list while iterating over it, but it causes an error.</w:t>
+      </w:r>
+      <w:r>
+        <w:br/>
+      </w:r>
+      <w:r>
+        <w:br/>
+        <w:t>Code:</w:t>
+      </w:r>
+      <w:r>
+        <w:br/>
+        <w:t xml:space="preserve">import </w:t>
       </w:r>
       <w:proofErr w:type="spellStart"/>
       <w:r>
-        <w:t>NullPointerException</w:t>
+        <w:t>java.util.ArrayList</w:t>
       </w:r>
       <w:proofErr w:type="spellEnd"/>
       <w:r>
-        <w:t xml:space="preserve"> when trying to access an object.</w:t>
-      </w:r>
-      <w:r>
-        <w:br/>
-      </w:r>
-      <w:r>
-        <w:br/>
-        <w:t>Code:</w:t>
-      </w:r>
-      <w:r>
-        <w:br/>
-        <w:t>class Person {</w:t>
-      </w:r>
-      <w:r>
-        <w:br/>
-        <w:t>String name;</w:t>
+        <w:t>;</w:t>
+      </w:r>
+      <w:r>
+        <w:br/>
+      </w:r>
+      <w:r>
+        <w:br/>
+        <w:t>public class Main {</w:t>
+      </w:r>
+      <w:r>
+        <w:br/>
+        <w:t xml:space="preserve">public static void main(String[] </w:t>
+      </w:r>
+      <w:proofErr w:type="spellStart"/>
+      <w:r>
+        <w:t>args</w:t>
+      </w:r>
+      <w:proofErr w:type="spellEnd"/>
+      <w:r>
+        <w:t>) {</w:t>
+      </w:r>
+      <w:r>
+        <w:br/>
+      </w:r>
+      <w:proofErr w:type="spellStart"/>
+      <w:r>
+        <w:t>ArrayList</w:t>
+      </w:r>
+      <w:proofErr w:type="spellEnd"/>
+      <w:r>
+        <w:t xml:space="preserve">&lt;Integer&gt; numbers = new </w:t>
+      </w:r>
+      <w:proofErr w:type="spellStart"/>
+      <w:r>
+        <w:t>ArrayList</w:t>
+      </w:r>
+      <w:proofErr w:type="spellEnd"/>
+      <w:r>
+        <w:t>&lt;&gt;();</w:t>
+      </w:r>
+      <w:r>
+        <w:br/>
+      </w:r>
+      <w:proofErr w:type="spellStart"/>
+      <w:r>
+        <w:t>numbers.add</w:t>
+      </w:r>
+      <w:proofErr w:type="spellEnd"/>
+      <w:r>
+        <w:t>(1);</w:t>
+      </w:r>
+      <w:r>
+        <w:br/>
+      </w:r>
+      <w:proofErr w:type="spellStart"/>
+      <w:r>
+        <w:t>numbers.add</w:t>
+      </w:r>
+      <w:proofErr w:type="spellEnd"/>
+      <w:r>
+        <w:t>(2);</w:t>
+      </w:r>
+      <w:r>
+        <w:br/>
+      </w:r>
+      <w:proofErr w:type="spellStart"/>
+      <w:r>
+        <w:t>numbers.add</w:t>
+      </w:r>
+      <w:proofErr w:type="spellEnd"/>
+      <w:r>
+        <w:t>(3);</w:t>
+      </w:r>
+      <w:r>
+        <w:br/>
+      </w:r>
+      <w:proofErr w:type="spellStart"/>
+      <w:r>
+        <w:t>numbers.add</w:t>
+      </w:r>
+      <w:proofErr w:type="spellEnd"/>
+      <w:r>
+        <w:t>(4);</w:t>
+      </w:r>
+      <w:r>
+        <w:br/>
+      </w:r>
+      <w:r>
+        <w:br/>
+        <w:t>for (int n : numbers) {</w:t>
+      </w:r>
+      <w:r>
+        <w:br/>
+        <w:t>if (n &gt; 2) {</w:t>
+      </w:r>
+      <w:r>
+        <w:br/>
+      </w:r>
+      <w:proofErr w:type="spellStart"/>
+      <w:r>
+        <w:t>numbers.remove</w:t>
+      </w:r>
+      <w:proofErr w:type="spellEnd"/>
+      <w:r>
+        <w:t>(n);</w:t>
       </w:r>
       <w:r>
         <w:br/>
@@ -3089,40 +2938,21 @@
       </w:r>
       <w:r>
         <w:br/>
-      </w:r>
-      <w:r>
-        <w:br/>
-        <w:t>public class Main {</w:t>
-      </w:r>
-      <w:r>
-        <w:br/>
-        <w:t xml:space="preserve">public static void main(String[] </w:t>
+        <w:t>}</w:t>
+      </w:r>
+      <w:r>
+        <w:br/>
+      </w:r>
+      <w:r>
+        <w:br/>
       </w:r>
       <w:proofErr w:type="spellStart"/>
       <w:r>
-        <w:t>args</w:t>
+        <w:t>System.out.println</w:t>
       </w:r>
       <w:proofErr w:type="spellEnd"/>
       <w:r>
-        <w:t>) {</w:t>
-      </w:r>
-      <w:r>
-        <w:br/>
-        <w:t>Person p = null;</w:t>
-      </w:r>
-      <w:r>
-        <w:br/>
-      </w:r>
-      <w:r>
-        <w:br/>
-      </w:r>
-      <w:proofErr w:type="spellStart"/>
-      <w:r>
-        <w:t>System.out.println</w:t>
-      </w:r>
-      <w:proofErr w:type="spellEnd"/>
-      <w:r>
-        <w:t>(p.name);</w:t>
+        <w:t>(numbers);</w:t>
       </w:r>
       <w:r>
         <w:br/>
@@ -3137,15 +2967,7 @@
       </w:r>
       <w:r>
         <w:br/>
-        <w:t xml:space="preserve">Why does this cause a </w:t>
-      </w:r>
-      <w:proofErr w:type="spellStart"/>
-      <w:r>
-        <w:t>NullPointerException</w:t>
-      </w:r>
-      <w:proofErr w:type="spellEnd"/>
-      <w:r>
-        <w:t>, and how can I fix it?</w:t>
+        <w:t>Why does this cause an error, and how can I fix it?</w:t>
       </w:r>
       <w:r>
         <w:br/>
@@ -3157,15 +2979,8 @@
         <w:pStyle w:val="Heading4"/>
       </w:pPr>
       <w:r>
-        <w:t xml:space="preserve"> Java sort </w:t>
-      </w:r>
-      <w:proofErr w:type="spellStart"/>
-      <w:r>
-        <w:t>ArrayList</w:t>
-      </w:r>
-      <w:proofErr w:type="spellEnd"/>
-      <w:r>
-        <w:t xml:space="preserve"> of objects</w:t>
+        <w:lastRenderedPageBreak/>
+        <w:t xml:space="preserve"> Java object null pointer exception</w:t>
       </w:r>
     </w:p>
     <w:p>
@@ -3178,227 +2993,94 @@
       </w:r>
       <w:r>
         <w:br/>
-        <w:t xml:space="preserve">I have an </w:t>
+        <w:t xml:space="preserve">I am getting a </w:t>
       </w:r>
       <w:proofErr w:type="spellStart"/>
       <w:r>
-        <w:t>ArrayList</w:t>
+        <w:t>NullPointerException</w:t>
       </w:r>
       <w:proofErr w:type="spellEnd"/>
       <w:r>
-        <w:t xml:space="preserve"> of objects, and I want to sort them based on one of their attributes.</w:t>
-      </w:r>
-      <w:r>
-        <w:br/>
-      </w:r>
-      <w:r>
-        <w:lastRenderedPageBreak/>
+        <w:t xml:space="preserve"> when trying to access an object.</w:t>
+      </w:r>
+      <w:r>
+        <w:br/>
+      </w:r>
+      <w:r>
         <w:br/>
         <w:t>Code:</w:t>
       </w:r>
       <w:r>
         <w:br/>
-        <w:t xml:space="preserve">import </w:t>
+        <w:t>class Person {</w:t>
+      </w:r>
+      <w:r>
+        <w:br/>
+        <w:t>String name;</w:t>
+      </w:r>
+      <w:r>
+        <w:br/>
+        <w:t>}</w:t>
+      </w:r>
+      <w:r>
+        <w:br/>
+      </w:r>
+      <w:r>
+        <w:br/>
+        <w:t>public class Main {</w:t>
+      </w:r>
+      <w:r>
+        <w:br/>
+        <w:t xml:space="preserve">public static void main(String[] </w:t>
       </w:r>
       <w:proofErr w:type="spellStart"/>
       <w:r>
-        <w:t>java.util.ArrayList</w:t>
+        <w:t>args</w:t>
       </w:r>
       <w:proofErr w:type="spellEnd"/>
       <w:r>
-        <w:t>;</w:t>
-      </w:r>
-      <w:r>
-        <w:br/>
-        <w:t xml:space="preserve">import </w:t>
+        <w:t>) {</w:t>
+      </w:r>
+      <w:r>
+        <w:br/>
+        <w:t>Person p = null;</w:t>
+      </w:r>
+      <w:r>
+        <w:br/>
+      </w:r>
+      <w:r>
+        <w:br/>
       </w:r>
       <w:proofErr w:type="spellStart"/>
       <w:r>
-        <w:t>java.util.Collections</w:t>
+        <w:t>System.out.println</w:t>
       </w:r>
       <w:proofErr w:type="spellEnd"/>
       <w:r>
-        <w:t>;</w:t>
-      </w:r>
-      <w:r>
-        <w:br/>
-        <w:t xml:space="preserve">import </w:t>
+        <w:t>(p.name);</w:t>
+      </w:r>
+      <w:r>
+        <w:br/>
+        <w:t>}</w:t>
+      </w:r>
+      <w:r>
+        <w:br/>
+        <w:t>}</w:t>
+      </w:r>
+      <w:r>
+        <w:br/>
+      </w:r>
+      <w:r>
+        <w:br/>
+        <w:t xml:space="preserve">Why does this cause a </w:t>
       </w:r>
       <w:proofErr w:type="spellStart"/>
       <w:r>
-        <w:t>java.util.Comparator</w:t>
+        <w:t>NullPointerException</w:t>
       </w:r>
       <w:proofErr w:type="spellEnd"/>
       <w:r>
-        <w:t>;</w:t>
-      </w:r>
-      <w:r>
-        <w:br/>
-      </w:r>
-      <w:r>
-        <w:br/>
-        <w:t>class Person {</w:t>
-      </w:r>
-      <w:r>
-        <w:br/>
-        <w:t>String name;</w:t>
-      </w:r>
-      <w:r>
-        <w:br/>
-        <w:t>int age;</w:t>
-      </w:r>
-      <w:r>
-        <w:br/>
-      </w:r>
-      <w:r>
-        <w:br/>
-        <w:t>Person(String name, int age) {</w:t>
-      </w:r>
-      <w:r>
-        <w:br/>
-        <w:t>this.name = name;</w:t>
-      </w:r>
-      <w:r>
-        <w:br/>
-      </w:r>
-      <w:proofErr w:type="spellStart"/>
-      <w:r>
-        <w:t>this.age</w:t>
-      </w:r>
-      <w:proofErr w:type="spellEnd"/>
-      <w:r>
-        <w:t xml:space="preserve"> = age;</w:t>
-      </w:r>
-      <w:r>
-        <w:br/>
-        <w:t>}</w:t>
-      </w:r>
-      <w:r>
-        <w:br/>
-        <w:t>}</w:t>
-      </w:r>
-      <w:r>
-        <w:br/>
-      </w:r>
-      <w:r>
-        <w:br/>
-        <w:t>public class Main {</w:t>
-      </w:r>
-      <w:r>
-        <w:br/>
-        <w:t xml:space="preserve">public static void main(String[] </w:t>
-      </w:r>
-      <w:proofErr w:type="spellStart"/>
-      <w:r>
-        <w:t>args</w:t>
-      </w:r>
-      <w:proofErr w:type="spellEnd"/>
-      <w:r>
-        <w:t>) {</w:t>
-      </w:r>
-      <w:r>
-        <w:br/>
-      </w:r>
-      <w:proofErr w:type="spellStart"/>
-      <w:r>
-        <w:t>ArrayList</w:t>
-      </w:r>
-      <w:proofErr w:type="spellEnd"/>
-      <w:r>
-        <w:t xml:space="preserve">&lt;Person&gt; people = new </w:t>
-      </w:r>
-      <w:proofErr w:type="spellStart"/>
-      <w:r>
-        <w:t>ArrayList</w:t>
-      </w:r>
-      <w:proofErr w:type="spellEnd"/>
-      <w:r>
-        <w:t>&lt;&gt;();</w:t>
-      </w:r>
-      <w:r>
-        <w:br/>
-      </w:r>
-      <w:proofErr w:type="spellStart"/>
-      <w:r>
-        <w:t>people.add</w:t>
-      </w:r>
-      <w:proofErr w:type="spellEnd"/>
-      <w:r>
-        <w:t>(new Person("Alice", 30));</w:t>
-      </w:r>
-      <w:r>
-        <w:br/>
-      </w:r>
-      <w:proofErr w:type="spellStart"/>
-      <w:r>
-        <w:t>people.add</w:t>
-      </w:r>
-      <w:proofErr w:type="spellEnd"/>
-      <w:r>
-        <w:t>(new Person("Bob", 25));</w:t>
-      </w:r>
-      <w:r>
-        <w:br/>
-      </w:r>
-      <w:proofErr w:type="spellStart"/>
-      <w:r>
-        <w:t>people.add</w:t>
-      </w:r>
-      <w:proofErr w:type="spellEnd"/>
-      <w:r>
-        <w:t>(new Person("Charlie", 35));</w:t>
-      </w:r>
-      <w:r>
-        <w:br/>
-      </w:r>
-      <w:r>
-        <w:br/>
-        <w:t>// sort by age here</w:t>
-      </w:r>
-      <w:r>
-        <w:br/>
-      </w:r>
-      <w:r>
-        <w:br/>
-        <w:t>for (Person p : people) {</w:t>
-      </w:r>
-      <w:r>
-        <w:br/>
-      </w:r>
-      <w:proofErr w:type="spellStart"/>
-      <w:r>
-        <w:t>System.out.println</w:t>
-      </w:r>
-      <w:proofErr w:type="spellEnd"/>
-      <w:r>
-        <w:t xml:space="preserve">(p.name + " " + </w:t>
-      </w:r>
-      <w:proofErr w:type="spellStart"/>
-      <w:r>
-        <w:t>p.age</w:t>
-      </w:r>
-      <w:proofErr w:type="spellEnd"/>
-      <w:r>
-        <w:t>);</w:t>
-      </w:r>
-      <w:r>
-        <w:br/>
-        <w:t>}</w:t>
-      </w:r>
-      <w:r>
-        <w:br/>
-        <w:t>}</w:t>
-      </w:r>
-      <w:r>
-        <w:br/>
-        <w:t>}</w:t>
-      </w:r>
-      <w:r>
-        <w:br/>
-      </w:r>
-      <w:r>
-        <w:br/>
-        <w:t>How can I sort this list by age?</w:t>
+        <w:t>, and how can I fix it?</w:t>
       </w:r>
       <w:r>
         <w:br/>
@@ -3410,7 +3092,7 @@
         <w:pStyle w:val="Heading4"/>
       </w:pPr>
       <w:r>
-        <w:t xml:space="preserve"> Java array vs </w:t>
+        <w:t xml:space="preserve"> Java sort </w:t>
       </w:r>
       <w:proofErr w:type="spellStart"/>
       <w:r>
@@ -3418,7 +3100,7 @@
       </w:r>
       <w:proofErr w:type="spellEnd"/>
       <w:r>
-        <w:t xml:space="preserve"> difference</w:t>
+        <w:t xml:space="preserve"> of objects</w:t>
       </w:r>
     </w:p>
     <w:p>
@@ -3431,6 +3113,259 @@
       </w:r>
       <w:r>
         <w:br/>
+        <w:t xml:space="preserve">I have an </w:t>
+      </w:r>
+      <w:proofErr w:type="spellStart"/>
+      <w:r>
+        <w:t>ArrayList</w:t>
+      </w:r>
+      <w:proofErr w:type="spellEnd"/>
+      <w:r>
+        <w:t xml:space="preserve"> of objects, and I want to sort them based on one of their attributes.</w:t>
+      </w:r>
+      <w:r>
+        <w:br/>
+      </w:r>
+      <w:r>
+        <w:br/>
+        <w:t>Code:</w:t>
+      </w:r>
+      <w:r>
+        <w:br/>
+        <w:t xml:space="preserve">import </w:t>
+      </w:r>
+      <w:proofErr w:type="spellStart"/>
+      <w:r>
+        <w:t>java.util.ArrayList</w:t>
+      </w:r>
+      <w:proofErr w:type="spellEnd"/>
+      <w:r>
+        <w:t>;</w:t>
+      </w:r>
+      <w:r>
+        <w:br/>
+        <w:t xml:space="preserve">import </w:t>
+      </w:r>
+      <w:proofErr w:type="spellStart"/>
+      <w:r>
+        <w:t>java.util.Collections</w:t>
+      </w:r>
+      <w:proofErr w:type="spellEnd"/>
+      <w:r>
+        <w:t>;</w:t>
+      </w:r>
+      <w:r>
+        <w:br/>
+        <w:t xml:space="preserve">import </w:t>
+      </w:r>
+      <w:proofErr w:type="spellStart"/>
+      <w:r>
+        <w:t>java.util.Comparator</w:t>
+      </w:r>
+      <w:proofErr w:type="spellEnd"/>
+      <w:r>
+        <w:t>;</w:t>
+      </w:r>
+      <w:r>
+        <w:br/>
+      </w:r>
+      <w:r>
+        <w:br/>
+        <w:t>class Person {</w:t>
+      </w:r>
+      <w:r>
+        <w:br/>
+        <w:t>String name;</w:t>
+      </w:r>
+      <w:r>
+        <w:br/>
+        <w:t>int age;</w:t>
+      </w:r>
+      <w:r>
+        <w:br/>
+      </w:r>
+      <w:r>
+        <w:br/>
+        <w:t>Person(String name, int age) {</w:t>
+      </w:r>
+      <w:r>
+        <w:br/>
+        <w:t>this.name = name;</w:t>
+      </w:r>
+      <w:r>
+        <w:br/>
+      </w:r>
+      <w:proofErr w:type="spellStart"/>
+      <w:r>
+        <w:t>this.age</w:t>
+      </w:r>
+      <w:proofErr w:type="spellEnd"/>
+      <w:r>
+        <w:t xml:space="preserve"> = age;</w:t>
+      </w:r>
+      <w:r>
+        <w:br/>
+        <w:t>}</w:t>
+      </w:r>
+      <w:r>
+        <w:br/>
+        <w:t>}</w:t>
+      </w:r>
+      <w:r>
+        <w:br/>
+      </w:r>
+      <w:r>
+        <w:br/>
+        <w:t>public class Main {</w:t>
+      </w:r>
+      <w:r>
+        <w:br/>
+        <w:t xml:space="preserve">public static void main(String[] </w:t>
+      </w:r>
+      <w:proofErr w:type="spellStart"/>
+      <w:r>
+        <w:t>args</w:t>
+      </w:r>
+      <w:proofErr w:type="spellEnd"/>
+      <w:r>
+        <w:t>) {</w:t>
+      </w:r>
+      <w:r>
+        <w:br/>
+      </w:r>
+      <w:proofErr w:type="spellStart"/>
+      <w:r>
+        <w:t>ArrayList</w:t>
+      </w:r>
+      <w:proofErr w:type="spellEnd"/>
+      <w:r>
+        <w:t xml:space="preserve">&lt;Person&gt; people = new </w:t>
+      </w:r>
+      <w:proofErr w:type="spellStart"/>
+      <w:r>
+        <w:t>ArrayList</w:t>
+      </w:r>
+      <w:proofErr w:type="spellEnd"/>
+      <w:r>
+        <w:t>&lt;&gt;();</w:t>
+      </w:r>
+      <w:r>
+        <w:br/>
+      </w:r>
+      <w:proofErr w:type="spellStart"/>
+      <w:r>
+        <w:lastRenderedPageBreak/>
+        <w:t>people.add</w:t>
+      </w:r>
+      <w:proofErr w:type="spellEnd"/>
+      <w:r>
+        <w:t>(new Person("Alice", 30));</w:t>
+      </w:r>
+      <w:r>
+        <w:br/>
+      </w:r>
+      <w:proofErr w:type="spellStart"/>
+      <w:r>
+        <w:t>people.add</w:t>
+      </w:r>
+      <w:proofErr w:type="spellEnd"/>
+      <w:r>
+        <w:t>(new Person("Bob", 25));</w:t>
+      </w:r>
+      <w:r>
+        <w:br/>
+      </w:r>
+      <w:proofErr w:type="spellStart"/>
+      <w:r>
+        <w:t>people.add</w:t>
+      </w:r>
+      <w:proofErr w:type="spellEnd"/>
+      <w:r>
+        <w:t>(new Person("Charlie", 35));</w:t>
+      </w:r>
+      <w:r>
+        <w:br/>
+      </w:r>
+      <w:r>
+        <w:br/>
+        <w:t>// sort by age here</w:t>
+      </w:r>
+      <w:r>
+        <w:br/>
+      </w:r>
+      <w:r>
+        <w:br/>
+        <w:t>for (Person p : people) {</w:t>
+      </w:r>
+      <w:r>
+        <w:br/>
+      </w:r>
+      <w:proofErr w:type="spellStart"/>
+      <w:r>
+        <w:t>System.out.println</w:t>
+      </w:r>
+      <w:proofErr w:type="spellEnd"/>
+      <w:r>
+        <w:t xml:space="preserve">(p.name + " " + </w:t>
+      </w:r>
+      <w:proofErr w:type="spellStart"/>
+      <w:r>
+        <w:t>p.age</w:t>
+      </w:r>
+      <w:proofErr w:type="spellEnd"/>
+      <w:r>
+        <w:t>);</w:t>
+      </w:r>
+      <w:r>
+        <w:br/>
+        <w:t>}</w:t>
+      </w:r>
+      <w:r>
+        <w:br/>
+        <w:t>}</w:t>
+      </w:r>
+      <w:r>
+        <w:br/>
+        <w:t>}</w:t>
+      </w:r>
+      <w:r>
+        <w:br/>
+      </w:r>
+      <w:r>
+        <w:br/>
+        <w:t>How can I sort this list by age?</w:t>
+      </w:r>
+      <w:r>
+        <w:br/>
+        <w:t>"""</w:t>
+      </w:r>
+    </w:p>
+    <w:p>
+      <w:pPr>
+        <w:pStyle w:val="Heading4"/>
+      </w:pPr>
+      <w:r>
+        <w:t xml:space="preserve"> Java array vs </w:t>
+      </w:r>
+      <w:proofErr w:type="spellStart"/>
+      <w:r>
+        <w:t>ArrayList</w:t>
+      </w:r>
+      <w:proofErr w:type="spellEnd"/>
+      <w:r>
+        <w:t xml:space="preserve"> difference</w:t>
+      </w:r>
+    </w:p>
+    <w:p>
+      <w:r>
+        <w:t>"""</w:t>
+      </w:r>
+      <w:r>
+        <w:br/>
+        <w:t>Question:</w:t>
+      </w:r>
+      <w:r>
+        <w:br/>
         <w:t>I am trying to add a new element to an array, but it does not work as expected.</w:t>
       </w:r>
       <w:r>
@@ -3465,9 +3400,6 @@
       </w:r>
       <w:r>
         <w:br/>
-      </w:r>
-      <w:r>
-        <w:lastRenderedPageBreak/>
         <w:t>numbers[3] = 4;</w:t>
       </w:r>
       <w:r>
@@ -3563,6 +3495,9 @@
       </w:r>
       <w:r>
         <w:br/>
+      </w:r>
+      <w:r>
+        <w:lastRenderedPageBreak/>
         <w:t>public class Main {</w:t>
       </w:r>
       <w:r>
@@ -3705,9 +3640,6 @@
       </w:r>
       <w:r>
         <w:br/>
-      </w:r>
-      <w:r>
-        <w:lastRenderedPageBreak/>
         <w:t>}</w:t>
       </w:r>
       <w:r>
@@ -3808,6 +3740,7 @@
         <w:pStyle w:val="Heading3"/>
       </w:pPr>
       <w:r>
+        <w:lastRenderedPageBreak/>
         <w:t>Framework</w:t>
       </w:r>
     </w:p>
@@ -3969,11 +3902,7 @@
       </w:r>
       <w:proofErr w:type="spellEnd"/>
       <w:r>
-        <w:t xml:space="preserve">/v1/locations' works, and how can I fix </w:t>
-      </w:r>
-      <w:r>
-        <w:lastRenderedPageBreak/>
-        <w:t>it?</w:t>
+        <w:t>/v1/locations' works, and how can I fix it?</w:t>
       </w:r>
       <w:r>
         <w:br/>

</xml_diff>